<commit_message>
sla 4 is added
</commit_message>
<xml_diff>
--- a/SLE_3_MAZE_Architecture/SLE3_25UAM040_Sanika Pingale.docx
+++ b/SLE_3_MAZE_Architecture/SLE3_25UAM040_Sanika Pingale.docx
@@ -134,42 +134,19 @@
           <w:szCs w:val="22"/>
         </w:rPr>
       </w:pPr>
-    </w:p>
-    <w:p>
-      <w:pPr>
-        <w:rPr>
-          <w:sz w:val="32"/>
-          <w:szCs w:val="32"/>
-        </w:rPr>
-      </w:pPr>
-      <w:r>
-        <w:rPr>
-          <w:sz w:val="32"/>
-          <w:szCs w:val="32"/>
-        </w:rPr>
-        <w:t>1.</w:t>
-      </w:r>
-      <w:r>
-        <w:rPr>
-          <w:sz w:val="32"/>
-          <w:szCs w:val="32"/>
-        </w:rPr>
-        <w:t>System Title &amp; Short Description</w:t>
-      </w:r>
-    </w:p>
-    <w:p>
-      <w:pPr>
+      <w:r>
         <w:rPr>
           <w:sz w:val="22"/>
           <w:szCs w:val="22"/>
         </w:rPr>
-      </w:pPr>
+        <w:t xml:space="preserve">Github link : </w:t>
+      </w:r>
       <w:r>
         <w:rPr>
           <w:sz w:val="22"/>
           <w:szCs w:val="22"/>
         </w:rPr>
-        <w:t>Maze Solving System using BFS and DFS</w:t>
+        <w:t>https://github.com/pingalesanika872-bit</w:t>
       </w:r>
     </w:p>
     <w:p>
@@ -179,20 +156,65 @@
           <w:szCs w:val="22"/>
         </w:rPr>
       </w:pPr>
-      <w:r>
+    </w:p>
+    <w:p>
+      <w:pPr>
+        <w:rPr>
+          <w:sz w:val="32"/>
+          <w:szCs w:val="32"/>
+        </w:rPr>
+      </w:pPr>
+      <w:r>
+        <w:rPr>
+          <w:sz w:val="32"/>
+          <w:szCs w:val="32"/>
+        </w:rPr>
+        <w:t>1.</w:t>
+      </w:r>
+      <w:r>
+        <w:rPr>
+          <w:sz w:val="32"/>
+          <w:szCs w:val="32"/>
+        </w:rPr>
+        <w:t>System Title &amp; Short Description</w:t>
+      </w:r>
+    </w:p>
+    <w:p>
+      <w:pPr>
         <w:rPr>
           <w:sz w:val="22"/>
           <w:szCs w:val="22"/>
         </w:rPr>
-        <w:t>The Maze Solving System finds a path from a starting point to a goal point in a maze. The user provides a maze, start position, and goal position. The system uses search algorithms such as BFS and DFS to explore the maze. It keeps track of visited cells and generates the final path as output.</w:t>
-      </w:r>
-    </w:p>
-    <w:p>
-      <w:pPr>
+      </w:pPr>
+      <w:r>
         <w:rPr>
           <w:sz w:val="22"/>
           <w:szCs w:val="22"/>
         </w:rPr>
+        <w:t>Maze Solving System using BFS and DFS</w:t>
+      </w:r>
+    </w:p>
+    <w:p>
+      <w:pPr>
+        <w:rPr>
+          <w:sz w:val="22"/>
+          <w:szCs w:val="22"/>
+        </w:rPr>
+      </w:pPr>
+      <w:r>
+        <w:rPr>
+          <w:sz w:val="22"/>
+          <w:szCs w:val="22"/>
+        </w:rPr>
+        <w:t>The Maze Solving System finds a path from a starting point to a goal point in a maze. The user provides a maze, start position, and goal position. The system uses search algorithms such as BFS and DFS to explore the maze. It keeps track of visited cells and generates the final path as output.</w:t>
+      </w:r>
+    </w:p>
+    <w:p>
+      <w:pPr>
+        <w:rPr>
+          <w:sz w:val="22"/>
+          <w:szCs w:val="22"/>
+        </w:rPr>
       </w:pPr>
     </w:p>
     <w:p>
@@ -214,15 +236,7 @@
           <w:sz w:val="32"/>
           <w:szCs w:val="32"/>
         </w:rPr>
-        <w:t>Context Diagram (Level 1</w:t>
-      </w:r>
-      <w:proofErr w:type="gramStart"/>
-      <w:r>
-        <w:rPr>
-          <w:sz w:val="32"/>
-          <w:szCs w:val="32"/>
-        </w:rPr>
-        <w:t>)</w:t>
+        <w:t>Context Diagram (Level 1)</w:t>
       </w:r>
       <w:r>
         <w:rPr>
@@ -231,7 +245,6 @@
         </w:rPr>
         <w:t xml:space="preserve"> :</w:t>
       </w:r>
-      <w:proofErr w:type="gramEnd"/>
     </w:p>
     <w:p>
       <w:pPr>
@@ -348,7 +361,6 @@
           <w:sz w:val="32"/>
           <w:szCs w:val="32"/>
         </w:rPr>
-        <w:lastRenderedPageBreak/>
         <w:t>3.</w:t>
       </w:r>
       <w:r>
@@ -356,15 +368,7 @@
           <w:sz w:val="32"/>
           <w:szCs w:val="32"/>
         </w:rPr>
-        <w:t>Container Diagram (level 2</w:t>
-      </w:r>
-      <w:proofErr w:type="gramStart"/>
-      <w:r>
-        <w:rPr>
-          <w:sz w:val="32"/>
-          <w:szCs w:val="32"/>
-        </w:rPr>
-        <w:t>)</w:t>
+        <w:t>Container Diagram (level 2)</w:t>
       </w:r>
       <w:r>
         <w:rPr>
@@ -373,7 +377,6 @@
         </w:rPr>
         <w:t xml:space="preserve"> :</w:t>
       </w:r>
-      <w:proofErr w:type="gramEnd"/>
     </w:p>
     <w:p>
       <w:pPr>
@@ -499,17 +502,8 @@
           <w:sz w:val="32"/>
           <w:szCs w:val="32"/>
         </w:rPr>
-        <w:t>Component Diagram (level 3</w:t>
-      </w:r>
-      <w:proofErr w:type="gramStart"/>
-      <w:r>
-        <w:rPr>
-          <w:sz w:val="32"/>
-          <w:szCs w:val="32"/>
-        </w:rPr>
-        <w:t>) :</w:t>
-      </w:r>
-      <w:proofErr w:type="gramEnd"/>
+        <w:t>Component Diagram (level 3) :</w:t>
+      </w:r>
     </w:p>
     <w:p>
       <w:pPr>
@@ -610,30 +604,14 @@
           <w:sz w:val="32"/>
           <w:szCs w:val="32"/>
         </w:rPr>
-        <w:t>Code Level Overview (Level 4</w:t>
-      </w:r>
-      <w:proofErr w:type="gramStart"/>
-      <w:r>
-        <w:rPr>
-          <w:sz w:val="32"/>
-          <w:szCs w:val="32"/>
-        </w:rPr>
-        <w:t>)</w:t>
-      </w:r>
-      <w:r>
-        <w:rPr>
-          <w:sz w:val="32"/>
-          <w:szCs w:val="32"/>
-        </w:rPr>
-        <w:t xml:space="preserve"> :</w:t>
-      </w:r>
-      <w:proofErr w:type="gramEnd"/>
-      <w:r>
-        <w:rPr>
-          <w:sz w:val="32"/>
-          <w:szCs w:val="32"/>
-        </w:rPr>
-        <w:t xml:space="preserve"> </w:t>
+        <w:t>Code Level Overview (Level 4)</w:t>
+      </w:r>
+      <w:r>
+        <w:rPr>
+          <w:sz w:val="32"/>
+          <w:szCs w:val="32"/>
+        </w:rPr>
+        <w:t xml:space="preserve"> : </w:t>
       </w:r>
     </w:p>
     <w:p>
@@ -668,18 +646,8 @@
           <w:numId w:val="1"/>
         </w:numPr>
       </w:pPr>
-      <w:proofErr w:type="spellStart"/>
-      <w:proofErr w:type="gramStart"/>
-      <w:r>
-        <w:t>bfs</w:t>
-      </w:r>
-      <w:proofErr w:type="spellEnd"/>
-      <w:r>
-        <w:t>(</w:t>
-      </w:r>
-      <w:proofErr w:type="gramEnd"/>
-      <w:r>
-        <w:t>) – Finds a path using Breadth First Search.</w:t>
+      <w:r>
+        <w:t>bfs() – Finds a path using Breadth First Search.</w:t>
       </w:r>
     </w:p>
     <w:p>
@@ -690,18 +658,8 @@
           <w:numId w:val="1"/>
         </w:numPr>
       </w:pPr>
-      <w:proofErr w:type="spellStart"/>
-      <w:proofErr w:type="gramStart"/>
-      <w:r>
-        <w:t>dfs</w:t>
-      </w:r>
-      <w:proofErr w:type="spellEnd"/>
-      <w:r>
-        <w:t>(</w:t>
-      </w:r>
-      <w:proofErr w:type="gramEnd"/>
-      <w:r>
-        <w:t>) – Finds a path using Depth First Search.</w:t>
+      <w:r>
+        <w:t>dfs() – Finds a path using Depth First Search.</w:t>
       </w:r>
     </w:p>
     <w:p>
@@ -712,21 +670,8 @@
           <w:numId w:val="1"/>
         </w:numPr>
       </w:pPr>
-      <w:proofErr w:type="spellStart"/>
-      <w:r>
-        <w:t>is_</w:t>
-      </w:r>
-      <w:proofErr w:type="gramStart"/>
-      <w:r>
-        <w:t>valid</w:t>
-      </w:r>
-      <w:proofErr w:type="spellEnd"/>
-      <w:r>
-        <w:t>(</w:t>
-      </w:r>
-      <w:proofErr w:type="gramEnd"/>
-      <w:r>
-        <w:t>) – Checks whether a cell can be visited.</w:t>
+      <w:r>
+        <w:t>is_valid() – Checks whether a cell can be visited.</w:t>
       </w:r>
     </w:p>
     <w:p>
@@ -737,21 +682,8 @@
           <w:numId w:val="1"/>
         </w:numPr>
       </w:pPr>
-      <w:proofErr w:type="spellStart"/>
-      <w:r>
-        <w:t>reconstruct_</w:t>
-      </w:r>
-      <w:proofErr w:type="gramStart"/>
-      <w:r>
-        <w:t>path</w:t>
-      </w:r>
-      <w:proofErr w:type="spellEnd"/>
-      <w:r>
-        <w:t>(</w:t>
-      </w:r>
-      <w:proofErr w:type="gramEnd"/>
-      <w:r>
-        <w:t>) – Creates the final path from start to goal.</w:t>
+      <w:r>
+        <w:t>reconstruct_path() – Creates the final path from start to goal.</w:t>
       </w:r>
     </w:p>
     <w:p/>
@@ -774,15 +706,7 @@
           <w:sz w:val="32"/>
           <w:szCs w:val="32"/>
         </w:rPr>
-        <w:t xml:space="preserve">Design </w:t>
-      </w:r>
-      <w:proofErr w:type="gramStart"/>
-      <w:r>
-        <w:rPr>
-          <w:sz w:val="32"/>
-          <w:szCs w:val="32"/>
-        </w:rPr>
-        <w:t>Decisions</w:t>
+        <w:t>Design Decisions</w:t>
       </w:r>
       <w:r>
         <w:rPr>
@@ -791,7 +715,6 @@
         </w:rPr>
         <w:t xml:space="preserve"> :</w:t>
       </w:r>
-      <w:proofErr w:type="gramEnd"/>
     </w:p>
     <w:p>
       <w:r>
@@ -818,62 +741,22 @@
           <w:sz w:val="32"/>
           <w:szCs w:val="32"/>
         </w:rPr>
-        <w:t>.</w:t>
-      </w:r>
-      <w:r>
-        <w:rPr>
-          <w:sz w:val="32"/>
-          <w:szCs w:val="32"/>
-        </w:rPr>
-        <w:t>AI Contribution Note:</w:t>
-      </w:r>
-    </w:p>
-    <w:p>
-      <w:r>
-        <w:t xml:space="preserve">        </w:t>
-      </w:r>
-      <w:r>
-        <w:t>•</w:t>
-      </w:r>
-      <w:r>
-        <w:t xml:space="preserve"> </w:t>
-      </w:r>
-      <w:r>
-        <w:t xml:space="preserve">AI tools used: ChatGPT </w:t>
-      </w:r>
-    </w:p>
-    <w:p>
-      <w:r>
-        <w:t xml:space="preserve">        </w:t>
-      </w:r>
-      <w:r>
-        <w:t>•</w:t>
-      </w:r>
-      <w:r>
-        <w:t xml:space="preserve"> </w:t>
-      </w:r>
-      <w:r>
-        <w:t xml:space="preserve">What AI helped with: Understanding the C4 Model, planning the architecture, and </w:t>
-      </w:r>
-      <w:r>
-        <w:t xml:space="preserve">    </w:t>
-      </w:r>
-      <w:r>
-        <w:t xml:space="preserve">preparing simple explanations. </w:t>
-      </w:r>
-    </w:p>
-    <w:p>
-      <w:r>
-        <w:t xml:space="preserve">        </w:t>
-      </w:r>
-      <w:r>
-        <w:t>•</w:t>
-      </w:r>
-      <w:r>
-        <w:t xml:space="preserve"> </w:t>
-      </w:r>
-      <w:r>
-        <w:t xml:space="preserve">What I did myself: Selected the Maze Solving System, created the diagrams, prepared the report, and understood the system design. </w:t>
+        <w:t>.AI Contribution Note:</w:t>
+      </w:r>
+    </w:p>
+    <w:p>
+      <w:r>
+        <w:t xml:space="preserve">        • AI tools used: ChatGPT </w:t>
+      </w:r>
+    </w:p>
+    <w:p>
+      <w:r>
+        <w:t xml:space="preserve">        • What AI helped with: Understanding the C4 Model, planning the architecture, and     preparing simple explanations. </w:t>
+      </w:r>
+    </w:p>
+    <w:p>
+      <w:r>
+        <w:t xml:space="preserve">        • What I did myself: Selected the Maze Solving System, created the diagrams, prepared the report, and understood the system design. </w:t>
       </w:r>
     </w:p>
     <w:p/>
@@ -896,14 +779,7 @@
           <w:sz w:val="32"/>
           <w:szCs w:val="32"/>
         </w:rPr>
-        <w:t>.</w:t>
-      </w:r>
-      <w:r>
-        <w:rPr>
-          <w:sz w:val="32"/>
-          <w:szCs w:val="32"/>
-        </w:rPr>
-        <w:t>Conclusion:</w:t>
+        <w:t>.Conclusion:</w:t>
       </w:r>
     </w:p>
     <w:p>

</xml_diff>